<commit_message>
docs: add seminar requirements coverage
</commit_message>
<xml_diff>
--- a/docs/magisterka.docx
+++ b/docs/magisterka.docx
@@ -1022,6 +1022,74 @@
     </w:p>
     <w:p>
       <w:pPr>
+        <w:pStyle w:val="Heading1"/>
+      </w:pPr>
+      <w:r>
+        <w:t>STRESZCZENIE</w:t>
+      </w:r>
+    </w:p>
+    <w:p>
+      <w:pPr/>
+      <w:r>
+        <w:t>Niniejsza praca przedstawia projekt i implementację systemu wyjaśnialnej sztucznej inteligencji wspierającego predykcję ryzyka śmiertelności u pacjentów z zapaleniem naczyń. Zakres pracy obejmuje przygotowanie danych klinicznych, budowę kontraktu wejściowego obejmującego 20 cech, implementację modeli uczenia maszynowego oraz integrację metod XAI takich jak LIME, SHAP, DALEX i EBM. Część aplikacyjna składa się z backendu FastAPI, interfejsu React/Vite oraz mechanizmów bezpieczeństwa ograniczających ryzyko błędnej interpretacji wyników medycznych. Weryfikacja obejmuje testy API, build frontendu, sprawdzenie integracji predykcji i kontrolę zgodności dokumentacji z aktualną architekturą projektu.</w:t>
+      </w:r>
+    </w:p>
+    <w:p>
+      <w:pPr/>
+      <w:r>
+        <w:t>Słowa kluczowe: wyjaśnialna sztuczna inteligencja, uczenie maszynowe, zapalenie naczyń, predykcja śmiertelności, FastAPI, React, XAI.</w:t>
+      </w:r>
+    </w:p>
+    <w:p>
+      <w:pPr>
+        <w:pStyle w:val="Heading1"/>
+      </w:pPr>
+      <w:r>
+        <w:t>ABSTRACT</w:t>
+      </w:r>
+    </w:p>
+    <w:p>
+      <w:pPr/>
+      <w:r>
+        <w:t>This thesis presents the design and implementation of an explainable artificial intelligence system supporting mortality risk prediction in patients with vasculitis. The scope includes clinical data preparation, a 20-feature input contract, machine learning model implementation, and the integration of XAI methods such as LIME, SHAP, DALEX, and EBM. The application layer consists of a FastAPI backend, a React/Vite frontend, and medical safety guardrails that reduce the risk of misinterpreting predictive outputs. Verification covers API tests, frontend production build, prediction integration checks, and alignment of the documentation with the current system architecture.</w:t>
+      </w:r>
+    </w:p>
+    <w:p>
+      <w:pPr/>
+      <w:r>
+        <w:t>Keywords: explainable artificial intelligence, machine learning, vasculitis, mortality prediction, FastAPI, React, XAI.</w:t>
+      </w:r>
+    </w:p>
+    <w:p>
+      <w:pPr>
+        <w:pStyle w:val="Heading1"/>
+      </w:pPr>
+      <w:r>
+        <w:t>SPIS TREŚCI</w:t>
+      </w:r>
+    </w:p>
+    <w:p>
+      <w:pPr/>
+      <w:r>
+        <w:t>1. WSTĘP</w:t>
+        <w:br/>
+        <w:t>2. PRZEGLĄD LITERATURY I PODSTAWY TEORETYCZNE</w:t>
+        <w:br/>
+        <w:t>3. METODOLOGIA</w:t>
+        <w:br/>
+        <w:t>4. IMPLEMENTACJA SYSTEMU</w:t>
+        <w:br/>
+        <w:t>5. WERYFIKACJA SYSTEMU</w:t>
+        <w:br/>
+        <w:t>6. DYSKUSJA I WKŁAD WŁASNY</w:t>
+        <w:br/>
+        <w:t>7. WNIOSKI</w:t>
+        <w:br/>
+        <w:t>8. BIBLIOGRAFIA</w:t>
+      </w:r>
+    </w:p>
+    <w:p>
+      <w:pPr>
         <w:jc w:val="left"/>
         <w:rPr>
           <w:rFonts w:cs="Times New Roman"/>
@@ -5739,12 +5807,86 @@
         <w:pStyle w:val="Heading1"/>
       </w:pPr>
       <w:r>
-        <w:t>6. WNIOSKI</w:t>
+        <w:t>6. DYSKUSJA I WKŁAD WŁASNY</w:t>
       </w:r>
     </w:p>
     <w:p>
       <w:r>
+        <w:t>Uzyskany system ma charakter aplikacyjno-badawczy: łączy przygotowanie danych klinicznych, implementację kontraktu predykcyjnego, integrację metod XAI oraz budowę kompletnego interfejsu użytkownika. Wkład własny autora obejmuje zaprojektowanie architektury backendu i frontendu, dostosowanie schematu wejściowego do 20 cech klinicznych, przygotowanie endpointów predykcyjnych i wyjaśniających, implementację widoków analitycznych oraz walidację integracji między warstwą React/Vite i FastAPI.</w:t>
+      </w:r>
+    </w:p>
+    <w:p>
+      <w:r>
+        <w:t>Oryginalność rozwiązania polega na połączeniu kilku metod wyjaśnialnej sztucznej inteligencji w jednym systemie wspierającym analizę ryzyka śmiertelności w zapaleniu naczyń. Zamiast ograniczać się do pojedynczej predykcji, aplikacja prezentuje wynik wraz z czynnikami wpływającymi na decyzję modelu, umożliwia porównanie wielu modeli oraz przewiduje tryby komunikacji dostosowane do odbiorcy. Takie podejście odpowiada wymaganiom systemów medycznych, w których sama skuteczność predykcyjna nie jest wystarczająca bez przejrzystości i kontroli bezpieczeństwa.</w:t>
+      </w:r>
+    </w:p>
+    <w:p>
+      <w:r>
+        <w:t>Najważniejszym ograniczeniem obecnej wersji jest zależność od jakości i kompletności danych wejściowych oraz konieczność dalszej walidacji klinicznej. Wyniki modelu powinny być traktowane jako wsparcie informacyjne, a nie narzędzie diagnostyczne. Dalszy rozwój powinien obejmować pełną walidację na niezależnym zbiorze danych, dopracowanie kalibracji prawdopodobieństw, optymalizację rozmiaru bundla frontendu oraz przygotowanie procedury wdrożeniowej z uwzględnieniem wymagań bezpieczeństwa i ochrony danych medycznych.</w:t>
+      </w:r>
+    </w:p>
+    <w:p>
+      <w:pPr>
+        <w:pStyle w:val="Heading1"/>
+      </w:pPr>
+      <w:r>
+        <w:t>7. WNIOSKI</w:t>
+      </w:r>
+    </w:p>
+    <w:p>
+      <w:r>
         <w:t>Zrealizowany system spełnia założenia aplikacji XAI wspierającej interpretowalną predykcję ryzyka śmiertelności w zapaleniu naczyń. Najważniejszą wartością systemu jest połączenie predykcji, wyjaśnień lokalnych i globalnych, porównania metod XAI oraz interfejsu umożliwiającego pracę zarówno na pojedynczym pacjencie, jak i na danych wsadowych. Aktualna architektura rozdziela backend FastAPI, frontend React/Vite oraz warstwę modelową, co ułatwia dalszy rozwój, testowanie i wdrożenie.</w:t>
+        <w:br/>
+        <w:br/>
+        <w:t>W odniesieniu do wymagań seminarium praca zawiera część teoretyczną, metodologiczną, implementacyjną i weryfikacyjną. Uzupełniono także streszczenie w języku polskim i angielskim, słowa kluczowe, dyskusję wyników, wskazanie wkładu własnego oraz bibliografię, co przygotowuje dokument do dalszych konsultacji promotorskich i końcowej redakcji.</w:t>
+      </w:r>
+    </w:p>
+    <w:p>
+      <w:pPr>
+        <w:pStyle w:val="Heading1"/>
+      </w:pPr>
+      <w:r>
+        <w:t>8. BIBLIOGRAFIA</w:t>
+      </w:r>
+    </w:p>
+    <w:p>
+      <w:r>
+        <w:t>1. Ribeiro M. T., Singh S., Guestrin C., "Why Should I Trust You?": Explaining the Predictions of Any Classifier, Proceedings of the 22nd ACM SIGKDD International Conference on Knowledge Discovery and Data Mining, 2016.</w:t>
+      </w:r>
+    </w:p>
+    <w:p>
+      <w:r>
+        <w:t>2. Lundberg S. M., Lee S.-I., A Unified Approach to Interpreting Model Predictions, Advances in Neural Information Processing Systems, 2017.</w:t>
+      </w:r>
+    </w:p>
+    <w:p>
+      <w:r>
+        <w:t>3. Molnar C., Interpretable Machine Learning: A Guide for Making Black Box Models Explainable, 2nd edition, 2022.</w:t>
+      </w:r>
+    </w:p>
+    <w:p>
+      <w:r>
+        <w:t>4. Guidotti R., Monreale A., Ruggieri S., Turini F., Giannotti F., Pedreschi D., A Survey of Methods for Explaining Black Box Models, ACM Computing Surveys, 2018.</w:t>
+      </w:r>
+    </w:p>
+    <w:p>
+      <w:r>
+        <w:t>5. Breiman L., Random Forests, Machine Learning, 2001.</w:t>
+      </w:r>
+    </w:p>
+    <w:p>
+      <w:r>
+        <w:t>6. Chen T., Guestrin C., XGBoost: A Scalable Tree Boosting System, Proceedings of the 22nd ACM SIGKDD International Conference on Knowledge Discovery and Data Mining, 2016.</w:t>
+      </w:r>
+    </w:p>
+    <w:p>
+      <w:r>
+        <w:t>7. Ke G. i in., LightGBM: A Highly Efficient Gradient Boosting Decision Tree, Advances in Neural Information Processing Systems, 2017.</w:t>
+      </w:r>
+    </w:p>
+    <w:p>
+      <w:r>
+        <w:t>8. Pydantic documentation, FastAPI documentation, React documentation oraz Vite documentation - dokumentacja techniczna wykorzystana podczas implementacji aplikacji.</w:t>
       </w:r>
     </w:p>
     <w:sectPr>

</xml_diff>

<commit_message>
docs: add application and code screenshots
</commit_message>
<xml_diff>
--- a/docs/magisterka.docx
+++ b/docs/magisterka.docx
@@ -1322,6 +1322,8 @@
         <w:t>10. SPIS RYSUNKÓW</w:t>
         <w:br/>
         <w:t>11. ANEKS: CHECKLISTA ZGODNOŚCI Z WYMAGANIAMI PANS</w:t>
+        <w:br/>
+        <w:t>12. ZAŁĄCZNIK: ZRZUTY EKRANU APLIKACJI I KODU</w:t>
       </w:r>
     </w:p>
     <w:p>
@@ -8840,10 +8842,6 @@
       </w:r>
     </w:p>
     <w:p>
-      <w:pPr>
-        <w:spacing w:line="360" w:lineRule="auto"/>
-        <w:jc w:val="both"/>
-      </w:pPr>
       <w:r>
         <w:rPr>
           <w:rFonts w:ascii="Times New Roman" w:hAnsi="Times New Roman"/>
@@ -8853,10 +8851,6 @@
       </w:r>
     </w:p>
     <w:p>
-      <w:pPr>
-        <w:spacing w:line="360" w:lineRule="auto"/>
-        <w:jc w:val="both"/>
-      </w:pPr>
       <w:r>
         <w:rPr>
           <w:rFonts w:ascii="Times New Roman" w:hAnsi="Times New Roman"/>
@@ -8866,16 +8860,84 @@
       </w:r>
     </w:p>
     <w:p>
-      <w:pPr>
-        <w:spacing w:line="360" w:lineRule="auto"/>
-        <w:jc w:val="both"/>
-      </w:pPr>
-      <w:r>
-        <w:rPr>
-          <w:rFonts w:ascii="Times New Roman" w:hAnsi="Times New Roman"/>
-          <w:sz w:val="24"/>
-        </w:rPr>
-        <w:br w:type="page"/>
+      <w:r>
+        <w:rPr>
+          <w:rFonts w:ascii="Times New Roman" w:hAnsi="Times New Roman"/>
+          <w:sz w:val="24"/>
+        </w:rPr>
+        <w:t>Rysunek 12.1. Formularz danych pacjenta w aplikacji React/Vite</w:t>
+      </w:r>
+    </w:p>
+    <w:p>
+      <w:r>
+        <w:rPr>
+          <w:rFonts w:ascii="Times New Roman" w:hAnsi="Times New Roman"/>
+          <w:sz w:val="24"/>
+        </w:rPr>
+        <w:t>Rysunek 12.2. Widok predykcji modeli i kluczowych czynników ryzyka</w:t>
+      </w:r>
+    </w:p>
+    <w:p>
+      <w:r>
+        <w:rPr>
+          <w:rFonts w:ascii="Times New Roman" w:hAnsi="Times New Roman"/>
+          <w:sz w:val="24"/>
+        </w:rPr>
+        <w:t>Rysunek 12.3. Widok wyjaśnienia SHAP dla przykładowego pacjenta</w:t>
+      </w:r>
+    </w:p>
+    <w:p>
+      <w:r>
+        <w:rPr>
+          <w:rFonts w:ascii="Times New Roman" w:hAnsi="Times New Roman"/>
+          <w:sz w:val="24"/>
+        </w:rPr>
+        <w:t>Rysunek 12.4. Tryb agenta konwersacyjnego AI</w:t>
+      </w:r>
+    </w:p>
+    <w:p>
+      <w:r>
+        <w:rPr>
+          <w:rFonts w:ascii="Times New Roman" w:hAnsi="Times New Roman"/>
+          <w:sz w:val="24"/>
+        </w:rPr>
+        <w:t>Rysunek 12.5. Tryb analizy masowej pacjentów</w:t>
+      </w:r>
+    </w:p>
+    <w:p>
+      <w:r>
+        <w:rPr>
+          <w:rFonts w:ascii="Times New Roman" w:hAnsi="Times New Roman"/>
+          <w:sz w:val="24"/>
+        </w:rPr>
+        <w:t>Rysunek 12.6. Fragment kodu schematu PatientInput w backendzie FastAPI</w:t>
+      </w:r>
+    </w:p>
+    <w:p>
+      <w:r>
+        <w:rPr>
+          <w:rFonts w:ascii="Times New Roman" w:hAnsi="Times New Roman"/>
+          <w:sz w:val="24"/>
+        </w:rPr>
+        <w:t>Rysunek 12.7. Fragment kodu walidacji zgodności modelu z listą cech</w:t>
+      </w:r>
+    </w:p>
+    <w:p>
+      <w:r>
+        <w:rPr>
+          <w:rFonts w:ascii="Times New Roman" w:hAnsi="Times New Roman"/>
+          <w:sz w:val="24"/>
+        </w:rPr>
+        <w:t>Rysunek 12.8. Fragment kodu formularza pacjenta w React</w:t>
+      </w:r>
+    </w:p>
+    <w:p>
+      <w:r>
+        <w:rPr>
+          <w:rFonts w:ascii="Times New Roman" w:hAnsi="Times New Roman"/>
+          <w:sz w:val="24"/>
+        </w:rPr>
+        <w:t>Rysunek 12.9. Fragment kodu konfiguracji proxy Vite do backendu API</w:t>
       </w:r>
     </w:p>
     <w:p>
@@ -9403,6 +9465,598 @@
           <w:sz w:val="24"/>
         </w:rPr>
         <w:t>Oświadczenie samodzielności: Oświadczam, że pracę dyplomową przygotowałem samodzielnie. Wszystkie dane, istotne myśli i sformułowania pochodzące z literatury, przytoczone dosłownie i niedosłownie, są opatrzone odpowiednimi odsyłaczami. Praca ta nie była w całości ani w części przez nikogo przedkładana do żadnej oceny i nie była publikowana.</w:t>
+      </w:r>
+    </w:p>
+    <w:p>
+      <w:r>
+        <w:rPr>
+          <w:rFonts w:ascii="Times New Roman" w:hAnsi="Times New Roman"/>
+          <w:sz w:val="24"/>
+        </w:rPr>
+        <w:br w:type="page"/>
+      </w:r>
+    </w:p>
+    <w:p>
+      <w:pPr>
+        <w:pStyle w:val="Heading1"/>
+      </w:pPr>
+      <w:r>
+        <w:rPr>
+          <w:rFonts w:ascii="Times New Roman" w:hAnsi="Times New Roman"/>
+          <w:b/>
+          <w:sz w:val="28"/>
+        </w:rPr>
+        <w:t>12. ZAŁĄCZNIK: ZRZUTY EKRANU APLIKACJI I KODU</w:t>
+      </w:r>
+    </w:p>
+    <w:p>
+      <w:pPr>
+        <w:jc w:val="both"/>
+      </w:pPr>
+      <w:r>
+        <w:rPr>
+          <w:rFonts w:ascii="Times New Roman" w:hAnsi="Times New Roman"/>
+          <w:sz w:val="24"/>
+        </w:rPr>
+        <w:t>Niniejszy załącznik dokumentuje praktyczny rezultat części wdrożeniowej pracy. Zrzuty aplikacji pokazują główne tryby działania interfejsu użytkownika, natomiast zrzuty kodu przedstawiają kluczowe fragmenty implementacji backendu i frontendu.</w:t>
+      </w:r>
+    </w:p>
+    <w:p>
+      <w:r>
+        <w:rPr>
+          <w:rFonts w:ascii="Times New Roman" w:hAnsi="Times New Roman"/>
+          <w:sz w:val="24"/>
+        </w:rPr>
+        <w:br w:type="page"/>
+      </w:r>
+    </w:p>
+    <w:p>
+      <w:r>
+        <w:rPr>
+          <w:rFonts w:ascii="Times New Roman" w:hAnsi="Times New Roman"/>
+          <w:sz w:val="24"/>
+        </w:rPr>
+        <w:drawing>
+          <wp:inline xmlns:a="http://schemas.openxmlformats.org/drawingml/2006/main" xmlns:pic="http://schemas.openxmlformats.org/drawingml/2006/picture">
+            <wp:extent cx="5400000" cy="3937500"/>
+            <wp:docPr id="101" name="Picture 101"/>
+            <wp:cNvGraphicFramePr>
+              <a:graphicFrameLocks noChangeAspect="1"/>
+            </wp:cNvGraphicFramePr>
+            <a:graphic>
+              <a:graphicData uri="http://schemas.openxmlformats.org/drawingml/2006/picture">
+                <pic:pic>
+                  <pic:nvPicPr>
+                    <pic:cNvPr id="0" name="app-01-formularz-pacjenta.png"/>
+                    <pic:cNvPicPr/>
+                  </pic:nvPicPr>
+                  <pic:blipFill>
+                    <a:blip r:embed="rId9"/>
+                    <a:stretch>
+                      <a:fillRect/>
+                    </a:stretch>
+                  </pic:blipFill>
+                  <pic:spPr>
+                    <a:xfrm>
+                      <a:off x="0" y="0"/>
+                      <a:ext cx="5400000" cy="3937500"/>
+                    </a:xfrm>
+                    <a:prstGeom prst="rect"/>
+                  </pic:spPr>
+                </pic:pic>
+              </a:graphicData>
+            </a:graphic>
+          </wp:inline>
+        </w:drawing>
+      </w:r>
+    </w:p>
+    <w:p>
+      <w:pPr>
+        <w:jc w:val="center"/>
+      </w:pPr>
+      <w:r>
+        <w:rPr>
+          <w:rFonts w:ascii="Times New Roman" w:hAnsi="Times New Roman"/>
+          <w:b/>
+          <w:sz w:val="20"/>
+        </w:rPr>
+        <w:t>Rysunek 12.1. Formularz danych pacjenta w aplikacji React/Vite</w:t>
+      </w:r>
+    </w:p>
+    <w:p>
+      <w:r>
+        <w:rPr>
+          <w:rFonts w:ascii="Times New Roman" w:hAnsi="Times New Roman"/>
+          <w:sz w:val="24"/>
+        </w:rPr>
+        <w:br w:type="page"/>
+      </w:r>
+    </w:p>
+    <w:p>
+      <w:r>
+        <w:rPr>
+          <w:rFonts w:ascii="Times New Roman" w:hAnsi="Times New Roman"/>
+          <w:sz w:val="24"/>
+        </w:rPr>
+        <w:drawing>
+          <wp:inline xmlns:a="http://schemas.openxmlformats.org/drawingml/2006/main" xmlns:pic="http://schemas.openxmlformats.org/drawingml/2006/picture">
+            <wp:extent cx="5400000" cy="3937500"/>
+            <wp:docPr id="102" name="Picture 102"/>
+            <wp:cNvGraphicFramePr>
+              <a:graphicFrameLocks noChangeAspect="1"/>
+            </wp:cNvGraphicFramePr>
+            <a:graphic>
+              <a:graphicData uri="http://schemas.openxmlformats.org/drawingml/2006/picture">
+                <pic:pic>
+                  <pic:nvPicPr>
+                    <pic:cNvPr id="0" name="app-02-wyniki-modeli.png"/>
+                    <pic:cNvPicPr/>
+                  </pic:nvPicPr>
+                  <pic:blipFill>
+                    <a:blip r:embed="rId10"/>
+                    <a:stretch>
+                      <a:fillRect/>
+                    </a:stretch>
+                  </pic:blipFill>
+                  <pic:spPr>
+                    <a:xfrm>
+                      <a:off x="0" y="0"/>
+                      <a:ext cx="5400000" cy="3937500"/>
+                    </a:xfrm>
+                    <a:prstGeom prst="rect"/>
+                  </pic:spPr>
+                </pic:pic>
+              </a:graphicData>
+            </a:graphic>
+          </wp:inline>
+        </w:drawing>
+      </w:r>
+    </w:p>
+    <w:p>
+      <w:pPr>
+        <w:jc w:val="center"/>
+      </w:pPr>
+      <w:r>
+        <w:rPr>
+          <w:rFonts w:ascii="Times New Roman" w:hAnsi="Times New Roman"/>
+          <w:b/>
+          <w:sz w:val="20"/>
+        </w:rPr>
+        <w:t>Rysunek 12.2. Widok predykcji modeli i kluczowych czynników ryzyka</w:t>
+      </w:r>
+    </w:p>
+    <w:p>
+      <w:r>
+        <w:rPr>
+          <w:rFonts w:ascii="Times New Roman" w:hAnsi="Times New Roman"/>
+          <w:sz w:val="24"/>
+        </w:rPr>
+        <w:br w:type="page"/>
+      </w:r>
+    </w:p>
+    <w:p>
+      <w:r>
+        <w:rPr>
+          <w:rFonts w:ascii="Times New Roman" w:hAnsi="Times New Roman"/>
+          <w:sz w:val="24"/>
+        </w:rPr>
+        <w:drawing>
+          <wp:inline xmlns:a="http://schemas.openxmlformats.org/drawingml/2006/main" xmlns:pic="http://schemas.openxmlformats.org/drawingml/2006/picture">
+            <wp:extent cx="5400000" cy="3937500"/>
+            <wp:docPr id="103" name="Picture 103"/>
+            <wp:cNvGraphicFramePr>
+              <a:graphicFrameLocks noChangeAspect="1"/>
+            </wp:cNvGraphicFramePr>
+            <a:graphic>
+              <a:graphicData uri="http://schemas.openxmlformats.org/drawingml/2006/picture">
+                <pic:pic>
+                  <pic:nvPicPr>
+                    <pic:cNvPr id="0" name="app-02-wyniki-modeli.png"/>
+                    <pic:cNvPicPr/>
+                  </pic:nvPicPr>
+                  <pic:blipFill>
+                    <a:blip r:embed="rId10"/>
+                    <a:stretch>
+                      <a:fillRect/>
+                    </a:stretch>
+                  </pic:blipFill>
+                  <pic:spPr>
+                    <a:xfrm>
+                      <a:off x="0" y="0"/>
+                      <a:ext cx="5400000" cy="3937500"/>
+                    </a:xfrm>
+                    <a:prstGeom prst="rect"/>
+                  </pic:spPr>
+                </pic:pic>
+              </a:graphicData>
+            </a:graphic>
+          </wp:inline>
+        </w:drawing>
+      </w:r>
+    </w:p>
+    <w:p>
+      <w:pPr>
+        <w:jc w:val="center"/>
+      </w:pPr>
+      <w:r>
+        <w:rPr>
+          <w:rFonts w:ascii="Times New Roman" w:hAnsi="Times New Roman"/>
+          <w:b/>
+          <w:sz w:val="20"/>
+        </w:rPr>
+        <w:t>Rysunek 12.3. Widok wyjaśnienia SHAP dla przykładowego pacjenta</w:t>
+      </w:r>
+    </w:p>
+    <w:p>
+      <w:r>
+        <w:rPr>
+          <w:rFonts w:ascii="Times New Roman" w:hAnsi="Times New Roman"/>
+          <w:sz w:val="24"/>
+        </w:rPr>
+        <w:br w:type="page"/>
+      </w:r>
+    </w:p>
+    <w:p>
+      <w:r>
+        <w:rPr>
+          <w:rFonts w:ascii="Times New Roman" w:hAnsi="Times New Roman"/>
+          <w:sz w:val="24"/>
+        </w:rPr>
+        <w:drawing>
+          <wp:inline xmlns:a="http://schemas.openxmlformats.org/drawingml/2006/main" xmlns:pic="http://schemas.openxmlformats.org/drawingml/2006/picture">
+            <wp:extent cx="5400000" cy="3937500"/>
+            <wp:docPr id="104" name="Picture 104"/>
+            <wp:cNvGraphicFramePr>
+              <a:graphicFrameLocks noChangeAspect="1"/>
+            </wp:cNvGraphicFramePr>
+            <a:graphic>
+              <a:graphicData uri="http://schemas.openxmlformats.org/drawingml/2006/picture">
+                <pic:pic>
+                  <pic:nvPicPr>
+                    <pic:cNvPr id="0" name="app-04-agent-ai.png"/>
+                    <pic:cNvPicPr/>
+                  </pic:nvPicPr>
+                  <pic:blipFill>
+                    <a:blip r:embed="rId11"/>
+                    <a:stretch>
+                      <a:fillRect/>
+                    </a:stretch>
+                  </pic:blipFill>
+                  <pic:spPr>
+                    <a:xfrm>
+                      <a:off x="0" y="0"/>
+                      <a:ext cx="5400000" cy="3937500"/>
+                    </a:xfrm>
+                    <a:prstGeom prst="rect"/>
+                  </pic:spPr>
+                </pic:pic>
+              </a:graphicData>
+            </a:graphic>
+          </wp:inline>
+        </w:drawing>
+      </w:r>
+    </w:p>
+    <w:p>
+      <w:pPr>
+        <w:jc w:val="center"/>
+      </w:pPr>
+      <w:r>
+        <w:rPr>
+          <w:rFonts w:ascii="Times New Roman" w:hAnsi="Times New Roman"/>
+          <w:b/>
+          <w:sz w:val="20"/>
+        </w:rPr>
+        <w:t>Rysunek 12.4. Tryb agenta konwersacyjnego AI</w:t>
+      </w:r>
+    </w:p>
+    <w:p>
+      <w:r>
+        <w:rPr>
+          <w:rFonts w:ascii="Times New Roman" w:hAnsi="Times New Roman"/>
+          <w:sz w:val="24"/>
+        </w:rPr>
+        <w:br w:type="page"/>
+      </w:r>
+    </w:p>
+    <w:p>
+      <w:r>
+        <w:rPr>
+          <w:rFonts w:ascii="Times New Roman" w:hAnsi="Times New Roman"/>
+          <w:sz w:val="24"/>
+        </w:rPr>
+        <w:drawing>
+          <wp:inline xmlns:a="http://schemas.openxmlformats.org/drawingml/2006/main" xmlns:pic="http://schemas.openxmlformats.org/drawingml/2006/picture">
+            <wp:extent cx="5400000" cy="3937500"/>
+            <wp:docPr id="105" name="Picture 105"/>
+            <wp:cNvGraphicFramePr>
+              <a:graphicFrameLocks noChangeAspect="1"/>
+            </wp:cNvGraphicFramePr>
+            <a:graphic>
+              <a:graphicData uri="http://schemas.openxmlformats.org/drawingml/2006/picture">
+                <pic:pic>
+                  <pic:nvPicPr>
+                    <pic:cNvPr id="0" name="app-05-analiza-masowa.png"/>
+                    <pic:cNvPicPr/>
+                  </pic:nvPicPr>
+                  <pic:blipFill>
+                    <a:blip r:embed="rId12"/>
+                    <a:stretch>
+                      <a:fillRect/>
+                    </a:stretch>
+                  </pic:blipFill>
+                  <pic:spPr>
+                    <a:xfrm>
+                      <a:off x="0" y="0"/>
+                      <a:ext cx="5400000" cy="3937500"/>
+                    </a:xfrm>
+                    <a:prstGeom prst="rect"/>
+                  </pic:spPr>
+                </pic:pic>
+              </a:graphicData>
+            </a:graphic>
+          </wp:inline>
+        </w:drawing>
+      </w:r>
+    </w:p>
+    <w:p>
+      <w:pPr>
+        <w:jc w:val="center"/>
+      </w:pPr>
+      <w:r>
+        <w:rPr>
+          <w:rFonts w:ascii="Times New Roman" w:hAnsi="Times New Roman"/>
+          <w:b/>
+          <w:sz w:val="20"/>
+        </w:rPr>
+        <w:t>Rysunek 12.5. Tryb analizy masowej pacjentów</w:t>
+      </w:r>
+    </w:p>
+    <w:p>
+      <w:r>
+        <w:rPr>
+          <w:rFonts w:ascii="Times New Roman" w:hAnsi="Times New Roman"/>
+          <w:sz w:val="24"/>
+        </w:rPr>
+        <w:br w:type="page"/>
+      </w:r>
+    </w:p>
+    <w:p>
+      <w:r>
+        <w:rPr>
+          <w:rFonts w:ascii="Times New Roman" w:hAnsi="Times New Roman"/>
+          <w:sz w:val="24"/>
+        </w:rPr>
+        <w:drawing>
+          <wp:inline xmlns:a="http://schemas.openxmlformats.org/drawingml/2006/main" xmlns:pic="http://schemas.openxmlformats.org/drawingml/2006/picture">
+            <wp:extent cx="5400000" cy="4806832"/>
+            <wp:docPr id="106" name="Picture 106"/>
+            <wp:cNvGraphicFramePr>
+              <a:graphicFrameLocks noChangeAspect="1"/>
+            </wp:cNvGraphicFramePr>
+            <a:graphic>
+              <a:graphicData uri="http://schemas.openxmlformats.org/drawingml/2006/picture">
+                <pic:pic>
+                  <pic:nvPicPr>
+                    <pic:cNvPr id="0" name="code-01-api-patient-input.png"/>
+                    <pic:cNvPicPr/>
+                  </pic:nvPicPr>
+                  <pic:blipFill>
+                    <a:blip r:embed="rId13"/>
+                    <a:stretch>
+                      <a:fillRect/>
+                    </a:stretch>
+                  </pic:blipFill>
+                  <pic:spPr>
+                    <a:xfrm>
+                      <a:off x="0" y="0"/>
+                      <a:ext cx="5400000" cy="4806832"/>
+                    </a:xfrm>
+                    <a:prstGeom prst="rect"/>
+                  </pic:spPr>
+                </pic:pic>
+              </a:graphicData>
+            </a:graphic>
+          </wp:inline>
+        </w:drawing>
+      </w:r>
+    </w:p>
+    <w:p>
+      <w:pPr>
+        <w:jc w:val="center"/>
+      </w:pPr>
+      <w:r>
+        <w:rPr>
+          <w:rFonts w:ascii="Times New Roman" w:hAnsi="Times New Roman"/>
+          <w:b/>
+          <w:sz w:val="20"/>
+        </w:rPr>
+        <w:t>Rysunek 12.6. Fragment kodu schematu PatientInput w backendzie FastAPI</w:t>
+      </w:r>
+    </w:p>
+    <w:p>
+      <w:r>
+        <w:rPr>
+          <w:rFonts w:ascii="Times New Roman" w:hAnsi="Times New Roman"/>
+          <w:sz w:val="24"/>
+        </w:rPr>
+        <w:br w:type="page"/>
+      </w:r>
+    </w:p>
+    <w:p>
+      <w:r>
+        <w:rPr>
+          <w:rFonts w:ascii="Times New Roman" w:hAnsi="Times New Roman"/>
+          <w:sz w:val="24"/>
+        </w:rPr>
+        <w:drawing>
+          <wp:inline xmlns:a="http://schemas.openxmlformats.org/drawingml/2006/main" xmlns:pic="http://schemas.openxmlformats.org/drawingml/2006/picture">
+            <wp:extent cx="5400000" cy="4026196"/>
+            <wp:docPr id="107" name="Picture 107"/>
+            <wp:cNvGraphicFramePr>
+              <a:graphicFrameLocks noChangeAspect="1"/>
+            </wp:cNvGraphicFramePr>
+            <a:graphic>
+              <a:graphicData uri="http://schemas.openxmlformats.org/drawingml/2006/picture">
+                <pic:pic>
+                  <pic:nvPicPr>
+                    <pic:cNvPr id="0" name="code-02-backend-model-guard.png"/>
+                    <pic:cNvPicPr/>
+                  </pic:nvPicPr>
+                  <pic:blipFill>
+                    <a:blip r:embed="rId14"/>
+                    <a:stretch>
+                      <a:fillRect/>
+                    </a:stretch>
+                  </pic:blipFill>
+                  <pic:spPr>
+                    <a:xfrm>
+                      <a:off x="0" y="0"/>
+                      <a:ext cx="5400000" cy="4026196"/>
+                    </a:xfrm>
+                    <a:prstGeom prst="rect"/>
+                  </pic:spPr>
+                </pic:pic>
+              </a:graphicData>
+            </a:graphic>
+          </wp:inline>
+        </w:drawing>
+      </w:r>
+    </w:p>
+    <w:p>
+      <w:pPr>
+        <w:jc w:val="center"/>
+      </w:pPr>
+      <w:r>
+        <w:rPr>
+          <w:rFonts w:ascii="Times New Roman" w:hAnsi="Times New Roman"/>
+          <w:b/>
+          <w:sz w:val="20"/>
+        </w:rPr>
+        <w:t>Rysunek 12.7. Fragment kodu walidacji zgodności modelu z listą cech</w:t>
+      </w:r>
+    </w:p>
+    <w:p>
+      <w:r>
+        <w:rPr>
+          <w:rFonts w:ascii="Times New Roman" w:hAnsi="Times New Roman"/>
+          <w:sz w:val="24"/>
+        </w:rPr>
+        <w:br w:type="page"/>
+      </w:r>
+    </w:p>
+    <w:p>
+      <w:r>
+        <w:rPr>
+          <w:rFonts w:ascii="Times New Roman" w:hAnsi="Times New Roman"/>
+          <w:sz w:val="24"/>
+        </w:rPr>
+        <w:drawing>
+          <wp:inline xmlns:a="http://schemas.openxmlformats.org/drawingml/2006/main" xmlns:pic="http://schemas.openxmlformats.org/drawingml/2006/picture">
+            <wp:extent cx="5400000" cy="4995871"/>
+            <wp:docPr id="108" name="Picture 108"/>
+            <wp:cNvGraphicFramePr>
+              <a:graphicFrameLocks noChangeAspect="1"/>
+            </wp:cNvGraphicFramePr>
+            <a:graphic>
+              <a:graphicData uri="http://schemas.openxmlformats.org/drawingml/2006/picture">
+                <pic:pic>
+                  <pic:nvPicPr>
+                    <pic:cNvPr id="0" name="code-03-react-patient-form.png"/>
+                    <pic:cNvPicPr/>
+                  </pic:nvPicPr>
+                  <pic:blipFill>
+                    <a:blip r:embed="rId15"/>
+                    <a:stretch>
+                      <a:fillRect/>
+                    </a:stretch>
+                  </pic:blipFill>
+                  <pic:spPr>
+                    <a:xfrm>
+                      <a:off x="0" y="0"/>
+                      <a:ext cx="5400000" cy="4995871"/>
+                    </a:xfrm>
+                    <a:prstGeom prst="rect"/>
+                  </pic:spPr>
+                </pic:pic>
+              </a:graphicData>
+            </a:graphic>
+          </wp:inline>
+        </w:drawing>
+      </w:r>
+    </w:p>
+    <w:p>
+      <w:pPr>
+        <w:jc w:val="center"/>
+      </w:pPr>
+      <w:r>
+        <w:rPr>
+          <w:rFonts w:ascii="Times New Roman" w:hAnsi="Times New Roman"/>
+          <w:b/>
+          <w:sz w:val="20"/>
+        </w:rPr>
+        <w:t>Rysunek 12.8. Fragment kodu formularza pacjenta w React</w:t>
+      </w:r>
+    </w:p>
+    <w:p>
+      <w:r>
+        <w:rPr>
+          <w:rFonts w:ascii="Times New Roman" w:hAnsi="Times New Roman"/>
+          <w:sz w:val="24"/>
+        </w:rPr>
+        <w:br w:type="page"/>
+      </w:r>
+    </w:p>
+    <w:p>
+      <w:r>
+        <w:rPr>
+          <w:rFonts w:ascii="Times New Roman" w:hAnsi="Times New Roman"/>
+          <w:sz w:val="24"/>
+        </w:rPr>
+        <w:drawing>
+          <wp:inline xmlns:a="http://schemas.openxmlformats.org/drawingml/2006/main" xmlns:pic="http://schemas.openxmlformats.org/drawingml/2006/picture">
+            <wp:extent cx="5400000" cy="3334304"/>
+            <wp:docPr id="109" name="Picture 109"/>
+            <wp:cNvGraphicFramePr>
+              <a:graphicFrameLocks noChangeAspect="1"/>
+            </wp:cNvGraphicFramePr>
+            <a:graphic>
+              <a:graphicData uri="http://schemas.openxmlformats.org/drawingml/2006/picture">
+                <pic:pic>
+                  <pic:nvPicPr>
+                    <pic:cNvPr id="0" name="code-04-vite-api-proxy.png"/>
+                    <pic:cNvPicPr/>
+                  </pic:nvPicPr>
+                  <pic:blipFill>
+                    <a:blip r:embed="rId16"/>
+                    <a:stretch>
+                      <a:fillRect/>
+                    </a:stretch>
+                  </pic:blipFill>
+                  <pic:spPr>
+                    <a:xfrm>
+                      <a:off x="0" y="0"/>
+                      <a:ext cx="5400000" cy="3334304"/>
+                    </a:xfrm>
+                    <a:prstGeom prst="rect"/>
+                  </pic:spPr>
+                </pic:pic>
+              </a:graphicData>
+            </a:graphic>
+          </wp:inline>
+        </w:drawing>
+      </w:r>
+    </w:p>
+    <w:p>
+      <w:pPr>
+        <w:jc w:val="center"/>
+      </w:pPr>
+      <w:r>
+        <w:rPr>
+          <w:rFonts w:ascii="Times New Roman" w:hAnsi="Times New Roman"/>
+          <w:b/>
+          <w:sz w:val="20"/>
+        </w:rPr>
+        <w:t>Rysunek 12.9. Fragment kodu konfiguracji proxy Vite do backendu API</w:t>
       </w:r>
     </w:p>
     <w:sectPr>

</xml_diff>